<commit_message>
docs: add comprehensive 6-year forensic schema drift audit and 6 real database case studies across docx, pdf, html, and md
</commit_message>
<xml_diff>
--- a/docs/CLIENT_PROPOSAL_METADATA_MIGRATION.docx
+++ b/docs/CLIENT_PROPOSAL_METADATA_MIGRATION.docx
@@ -12,15 +12,15 @@
           <w:b/>
           <w:bCs/>
           <w:color w:val="0F172A"/>
-          <w:sz w:val="38"/>
-          <w:szCs w:val="38"/>
+          <w:sz w:val="36"/>
+          <w:szCs w:val="36"/>
         </w:rPr>
         <w:t xml:space="preserve">Executive Proposal: Standardizing Media Metadata Extraction via In-House Engine</w:t>
       </w:r>
     </w:p>
     <w:p>
       <w:pPr>
-        <w:spacing w:after="300"/>
+        <w:spacing w:after="240"/>
       </w:pPr>
       <w:r>
         <w:rPr>
@@ -66,7 +66,7 @@
     <w:p>
       <w:pPr>
         <w:pStyle w:val="Heading1"/>
-        <w:spacing w:after="120" w:before="280"/>
+        <w:spacing w:after="100" w:before="260"/>
       </w:pPr>
       <w:r>
         <w:rPr>
@@ -74,15 +74,15 @@
           <w:b/>
           <w:bCs/>
           <w:color w:val="0F172A"/>
-          <w:sz w:val="30"/>
-          <w:szCs w:val="30"/>
+          <w:sz w:val="28"/>
+          <w:szCs w:val="28"/>
         </w:rPr>
         <w:t xml:space="preserve">1. Executive Summary</w:t>
       </w:r>
     </w:p>
     <w:p>
       <w:pPr>
-        <w:spacing w:after="140" w:before="120"/>
+        <w:spacing w:after="120" w:before="100"/>
       </w:pPr>
       <w:r>
         <w:rPr>
@@ -100,7 +100,7 @@
     </w:p>
     <w:p>
       <w:pPr>
-        <w:spacing w:after="140" w:before="120"/>
+        <w:spacing w:after="120" w:before="100"/>
       </w:pPr>
       <w:r>
         <w:rPr>
@@ -118,7 +118,7 @@
     </w:p>
     <w:p>
       <w:pPr>
-        <w:spacing w:after="140" w:before="120"/>
+        <w:spacing w:after="120" w:before="100"/>
       </w:pPr>
       <w:r>
         <w:rPr>
@@ -136,7 +136,7 @@
     </w:p>
     <w:p>
       <w:pPr>
-        <w:spacing w:after="140" w:before="120"/>
+        <w:spacing w:after="120" w:before="100"/>
       </w:pPr>
       <w:r>
         <w:rPr>
@@ -154,7 +154,7 @@
     </w:p>
     <w:p>
       <w:pPr>
-        <w:spacing w:after="140" w:before="120"/>
+        <w:spacing w:after="120" w:before="100"/>
       </w:pPr>
       <w:r>
         <w:rPr>
@@ -172,7 +172,7 @@
     </w:p>
     <w:p>
       <w:pPr>
-        <w:spacing w:after="140" w:before="120"/>
+        <w:spacing w:after="120" w:before="100"/>
       </w:pPr>
       <w:r>
         <w:rPr>
@@ -191,7 +191,7 @@
     <w:p>
       <w:pPr>
         <w:pStyle w:val="Heading1"/>
-        <w:spacing w:after="120" w:before="280"/>
+        <w:spacing w:after="100" w:before="260"/>
       </w:pPr>
       <w:r>
         <w:rPr>
@@ -199,32 +199,15 @@
           <w:b/>
           <w:bCs/>
           <w:color w:val="0F172A"/>
-          <w:sz w:val="30"/>
-          <w:szCs w:val="30"/>
-        </w:rPr>
-        <w:t xml:space="preserve">2. Ingestion Architecture &amp; Technical Rationale</w:t>
-      </w:r>
-    </w:p>
-    <w:p>
-      <w:pPr>
-        <w:pStyle w:val="Heading2"/>
-        <w:spacing w:after="120" w:before="280"/>
-      </w:pPr>
-      <w:r>
-        <w:rPr>
-          <w:rFonts w:ascii="Arial" w:cs="Arial" w:eastAsia="Arial" w:hAnsi="Arial"/>
-          <w:b/>
-          <w:bCs/>
-          <w:color w:val="0F172A"/>
-          <w:sz w:val="26"/>
-          <w:szCs w:val="26"/>
-        </w:rPr>
-        <w:t xml:space="preserve">Current Architecture Workflow:</w:t>
-      </w:r>
-    </w:p>
-    <w:p>
-      <w:pPr>
-        <w:spacing w:after="140" w:before="120"/>
+          <w:sz w:val="28"/>
+          <w:szCs w:val="28"/>
+        </w:rPr>
+        <w:t xml:space="preserve">2. Ingestion Architecture Workflow</w:t>
+      </w:r>
+    </w:p>
+    <w:p>
+      <w:pPr>
+        <w:spacing w:after="120" w:before="100"/>
       </w:pPr>
       <w:r>
         <w:rPr>
@@ -242,7 +225,7 @@
     </w:p>
     <w:p>
       <w:pPr>
-        <w:spacing w:after="140" w:before="120"/>
+        <w:spacing w:after="120" w:before="100"/>
       </w:pPr>
       <w:r>
         <w:rPr>
@@ -260,7 +243,7 @@
     </w:p>
     <w:p>
       <w:pPr>
-        <w:spacing w:after="140" w:before="120"/>
+        <w:spacing w:after="120" w:before="100"/>
       </w:pPr>
       <w:r>
         <w:rPr>
@@ -273,12 +256,12 @@
           <w:sz w:val="24"/>
           <w:szCs w:val="24"/>
         </w:rPr>
-        <w:t xml:space="preserve">3. Backend Service: Asynchronous / Non-blocking Fire-and-Forget Trigger to Existing AWS Lambda</w:t>
-      </w:r>
-    </w:p>
-    <w:p>
-      <w:pPr>
-        <w:spacing w:after="140" w:before="120"/>
+        <w:t xml:space="preserve">3. Backend Service: Enqueue Task in Amazon SQS Queue Buffer (Fire-and-forget)</w:t>
+      </w:r>
+    </w:p>
+    <w:p>
+      <w:pPr>
+        <w:spacing w:after="120" w:before="100"/>
       </w:pPr>
       <w:r>
         <w:rPr>
@@ -291,12 +274,12 @@
           <w:sz w:val="24"/>
           <w:szCs w:val="24"/>
         </w:rPr>
-        <w:t xml:space="preserve">4. Existing AWS Lambda: External API Call (2s - 28s) to CloudConvert SaaS</w:t>
-      </w:r>
-    </w:p>
-    <w:p>
-      <w:pPr>
-        <w:spacing w:after="140" w:before="120"/>
+        <w:t xml:space="preserve">4. Amazon SQS Queue: Asynchronous Trigger to Existing AWS Lambda (In-House Engine: &lt;400ms)</w:t>
+      </w:r>
+    </w:p>
+    <w:p>
+      <w:pPr>
+        <w:spacing w:after="120" w:before="100"/>
       </w:pPr>
       <w:r>
         <w:rPr>
@@ -314,8 +297,8 @@
     </w:p>
     <w:p>
       <w:pPr>
-        <w:pStyle w:val="Heading2"/>
-        <w:spacing w:after="120" w:before="280"/>
+        <w:pStyle w:val="Heading1"/>
+        <w:spacing w:after="100" w:before="260"/>
       </w:pPr>
       <w:r>
         <w:rPr>
@@ -323,15 +306,15 @@
           <w:b/>
           <w:bCs/>
           <w:color w:val="0F172A"/>
-          <w:sz w:val="26"/>
-          <w:szCs w:val="26"/>
-        </w:rPr>
-        <w:t xml:space="preserve">Target Architecture (In-House Engine with Queue Buffering):</w:t>
-      </w:r>
-    </w:p>
-    <w:p>
-      <w:pPr>
-        <w:spacing w:after="140" w:before="120"/>
+          <w:sz w:val="28"/>
+          <w:szCs w:val="28"/>
+        </w:rPr>
+        <w:t xml:space="preserve">3. Forensic Analysis: 6-Year Schema Drift &amp; Database Impact</w:t>
+      </w:r>
+    </w:p>
+    <w:p>
+      <w:pPr>
+        <w:spacing w:after="120" w:before="100"/>
       </w:pPr>
       <w:r>
         <w:rPr>
@@ -344,12 +327,487 @@
           <w:sz w:val="24"/>
           <w:szCs w:val="24"/>
         </w:rPr>
-        <w:t xml:space="preserve">1. User / Frontend: Direct File Upload to Amazon S3</w:t>
-      </w:r>
-    </w:p>
-    <w:p>
-      <w:pPr>
-        <w:spacing w:after="140" w:before="120"/>
+        <w:t xml:space="preserve">A forensic database audit of 593,504 files in the database revealed how CloudConvert's silent upstream tool upgrades generated distinct generations of conflicting metadata structures:</w:t>
+      </w:r>
+    </w:p>
+    <w:tbl>
+      <w:tblPr>
+        <w:tblW w:type="pct" w:w="100%"/>
+        <w:tblBorders>
+          <w:top w:val="single" w:color="auto" w:sz="4"/>
+          <w:left w:val="single" w:color="auto" w:sz="4"/>
+          <w:bottom w:val="single" w:color="auto" w:sz="4"/>
+          <w:right w:val="single" w:color="auto" w:sz="4"/>
+          <w:insideH w:val="single" w:color="auto" w:sz="4"/>
+          <w:insideV w:val="single" w:color="auto" w:sz="4"/>
+        </w:tblBorders>
+      </w:tblPr>
+      <w:tblGrid>
+        <w:gridCol w:w="100"/>
+        <w:gridCol w:w="100"/>
+        <w:gridCol w:w="100"/>
+        <w:gridCol w:w="100"/>
+        <w:gridCol w:w="100"/>
+      </w:tblGrid>
+      <w:tr>
+        <w:tc>
+          <w:tcPr>
+            <w:tcW w:type="pct" w:w="18%"/>
+            <w:shd w:fill="F1F5F9" w:val="clear"/>
+          </w:tcPr>
+          <w:p>
+            <w:pPr>
+              <w:spacing w:after="80" w:before="80"/>
+            </w:pPr>
+            <w:r>
+              <w:rPr>
+                <w:rFonts w:ascii="Arial" w:cs="Arial" w:eastAsia="Arial" w:hAnsi="Arial"/>
+                <w:b/>
+                <w:bCs/>
+                <w:color w:val="0F172A"/>
+                <w:sz w:val="22"/>
+                <w:szCs w:val="22"/>
+              </w:rPr>
+              <w:t xml:space="preserve">Generation</w:t>
+            </w:r>
+          </w:p>
+        </w:tc>
+        <w:tc>
+          <w:tcPr>
+            <w:tcW w:type="pct" w:w="18%"/>
+            <w:shd w:fill="F1F5F9" w:val="clear"/>
+          </w:tcPr>
+          <w:p>
+            <w:pPr>
+              <w:spacing w:after="80" w:before="80"/>
+            </w:pPr>
+            <w:r>
+              <w:rPr>
+                <w:rFonts w:ascii="Arial" w:cs="Arial" w:eastAsia="Arial" w:hAnsi="Arial"/>
+                <w:b/>
+                <w:bCs/>
+                <w:color w:val="0F172A"/>
+                <w:sz w:val="22"/>
+                <w:szCs w:val="22"/>
+              </w:rPr>
+              <w:t xml:space="preserve">Engine Version Recorded</w:t>
+            </w:r>
+          </w:p>
+        </w:tc>
+        <w:tc>
+          <w:tcPr>
+            <w:tcW w:type="pct" w:w="14%"/>
+            <w:shd w:fill="F1F5F9" w:val="clear"/>
+          </w:tcPr>
+          <w:p>
+            <w:pPr>
+              <w:spacing w:after="80" w:before="80"/>
+            </w:pPr>
+            <w:r>
+              <w:rPr>
+                <w:rFonts w:ascii="Arial" w:cs="Arial" w:eastAsia="Arial" w:hAnsi="Arial"/>
+                <w:b/>
+                <w:bCs/>
+                <w:color w:val="0F172A"/>
+                <w:sz w:val="22"/>
+                <w:szCs w:val="22"/>
+              </w:rPr>
+              <w:t xml:space="preserve">Asset Count</w:t>
+            </w:r>
+          </w:p>
+        </w:tc>
+        <w:tc>
+          <w:tcPr>
+            <w:tcW w:type="pct" w:w="20%"/>
+            <w:shd w:fill="F1F5F9" w:val="clear"/>
+          </w:tcPr>
+          <w:p>
+            <w:pPr>
+              <w:spacing w:after="80" w:before="80"/>
+            </w:pPr>
+            <w:r>
+              <w:rPr>
+                <w:rFonts w:ascii="Arial" w:cs="Arial" w:eastAsia="Arial" w:hAnsi="Arial"/>
+                <w:b/>
+                <w:bCs/>
+                <w:color w:val="0F172A"/>
+                <w:sz w:val="22"/>
+                <w:szCs w:val="22"/>
+              </w:rPr>
+              <w:t xml:space="preserve">Date Range</w:t>
+            </w:r>
+          </w:p>
+        </w:tc>
+        <w:tc>
+          <w:tcPr>
+            <w:tcW w:type="pct" w:w="30%"/>
+            <w:shd w:fill="F1F5F9" w:val="clear"/>
+          </w:tcPr>
+          <w:p>
+            <w:pPr>
+              <w:spacing w:after="80" w:before="80"/>
+            </w:pPr>
+            <w:r>
+              <w:rPr>
+                <w:rFonts w:ascii="Arial" w:cs="Arial" w:eastAsia="Arial" w:hAnsi="Arial"/>
+                <w:b/>
+                <w:bCs/>
+                <w:color w:val="0F172A"/>
+                <w:sz w:val="22"/>
+                <w:szCs w:val="22"/>
+              </w:rPr>
+              <w:t xml:space="preserve">Impact on Database Records</w:t>
+            </w:r>
+          </w:p>
+        </w:tc>
+      </w:tr>
+      <w:tr>
+        <w:tc>
+          <w:tcPr>
+            <w:tcW w:type="pct" w:w="18%"/>
+          </w:tcPr>
+          <w:p>
+            <w:pPr>
+              <w:spacing w:after="80" w:before="80"/>
+            </w:pPr>
+            <w:r>
+              <w:rPr>
+                <w:rFonts w:ascii="Arial" w:cs="Arial" w:eastAsia="Arial" w:hAnsi="Arial"/>
+                <w:b w:val="false"/>
+                <w:bCs w:val="false"/>
+                <w:color w:val="334155"/>
+                <w:sz w:val="22"/>
+                <w:szCs w:val="22"/>
+              </w:rPr>
+              <w:t xml:space="preserve">Generation 1</w:t>
+            </w:r>
+          </w:p>
+        </w:tc>
+        <w:tc>
+          <w:tcPr>
+            <w:tcW w:type="pct" w:w="18%"/>
+          </w:tcPr>
+          <w:p>
+            <w:pPr>
+              <w:spacing w:after="80" w:before="80"/>
+            </w:pPr>
+            <w:r>
+              <w:rPr>
+                <w:rFonts w:ascii="Arial" w:cs="Arial" w:eastAsia="Arial" w:hAnsi="Arial"/>
+                <w:b w:val="false"/>
+                <w:bCs w:val="false"/>
+                <w:color w:val="334155"/>
+                <w:sz w:val="22"/>
+                <w:szCs w:val="22"/>
+              </w:rPr>
+              <w:t xml:space="preserve">v12.36</w:t>
+            </w:r>
+          </w:p>
+        </w:tc>
+        <w:tc>
+          <w:tcPr>
+            <w:tcW w:type="pct" w:w="14%"/>
+          </w:tcPr>
+          <w:p>
+            <w:pPr>
+              <w:spacing w:after="80" w:before="80"/>
+            </w:pPr>
+            <w:r>
+              <w:rPr>
+                <w:rFonts w:ascii="Arial" w:cs="Arial" w:eastAsia="Arial" w:hAnsi="Arial"/>
+                <w:b w:val="false"/>
+                <w:bCs w:val="false"/>
+                <w:color w:val="334155"/>
+                <w:sz w:val="22"/>
+                <w:szCs w:val="22"/>
+              </w:rPr>
+              <w:t xml:space="preserve">18,029</w:t>
+            </w:r>
+          </w:p>
+        </w:tc>
+        <w:tc>
+          <w:tcPr>
+            <w:tcW w:type="pct" w:w="20%"/>
+          </w:tcPr>
+          <w:p>
+            <w:pPr>
+              <w:spacing w:after="80" w:before="80"/>
+            </w:pPr>
+            <w:r>
+              <w:rPr>
+                <w:rFonts w:ascii="Arial" w:cs="Arial" w:eastAsia="Arial" w:hAnsi="Arial"/>
+                <w:b w:val="false"/>
+                <w:bCs w:val="false"/>
+                <w:color w:val="334155"/>
+                <w:sz w:val="22"/>
+                <w:szCs w:val="22"/>
+              </w:rPr>
+              <w:t xml:space="preserve">Feb 2022 – Feb 2024</w:t>
+            </w:r>
+          </w:p>
+        </w:tc>
+        <w:tc>
+          <w:tcPr>
+            <w:tcW w:type="pct" w:w="30%"/>
+          </w:tcPr>
+          <w:p>
+            <w:pPr>
+              <w:spacing w:after="80" w:before="80"/>
+            </w:pPr>
+            <w:r>
+              <w:rPr>
+                <w:rFonts w:ascii="Arial" w:cs="Arial" w:eastAsia="Arial" w:hAnsi="Arial"/>
+                <w:b w:val="false"/>
+                <w:bCs w:val="false"/>
+                <w:color w:val="334155"/>
+                <w:sz w:val="22"/>
+                <w:szCs w:val="22"/>
+              </w:rPr>
+              <w:t xml:space="preserve">Early CloudConvert worker version (decimal duration formats, early bitrate tags)</w:t>
+            </w:r>
+          </w:p>
+        </w:tc>
+      </w:tr>
+      <w:tr>
+        <w:tc>
+          <w:tcPr>
+            <w:tcW w:type="pct" w:w="18%"/>
+          </w:tcPr>
+          <w:p>
+            <w:pPr>
+              <w:spacing w:after="80" w:before="80"/>
+            </w:pPr>
+            <w:r>
+              <w:rPr>
+                <w:rFonts w:ascii="Arial" w:cs="Arial" w:eastAsia="Arial" w:hAnsi="Arial"/>
+                <w:b w:val="false"/>
+                <w:bCs w:val="false"/>
+                <w:color w:val="334155"/>
+                <w:sz w:val="22"/>
+                <w:szCs w:val="22"/>
+              </w:rPr>
+              <w:t xml:space="preserve">Generation 2</w:t>
+            </w:r>
+          </w:p>
+        </w:tc>
+        <w:tc>
+          <w:tcPr>
+            <w:tcW w:type="pct" w:w="18%"/>
+          </w:tcPr>
+          <w:p>
+            <w:pPr>
+              <w:spacing w:after="80" w:before="80"/>
+            </w:pPr>
+            <w:r>
+              <w:rPr>
+                <w:rFonts w:ascii="Arial" w:cs="Arial" w:eastAsia="Arial" w:hAnsi="Arial"/>
+                <w:b w:val="false"/>
+                <w:bCs w:val="false"/>
+                <w:color w:val="334155"/>
+                <w:sz w:val="22"/>
+                <w:szCs w:val="22"/>
+              </w:rPr>
+              <w:t xml:space="preserve">v12.56</w:t>
+            </w:r>
+          </w:p>
+        </w:tc>
+        <w:tc>
+          <w:tcPr>
+            <w:tcW w:type="pct" w:w="14%"/>
+          </w:tcPr>
+          <w:p>
+            <w:pPr>
+              <w:spacing w:after="80" w:before="80"/>
+            </w:pPr>
+            <w:r>
+              <w:rPr>
+                <w:rFonts w:ascii="Arial" w:cs="Arial" w:eastAsia="Arial" w:hAnsi="Arial"/>
+                <w:b w:val="false"/>
+                <w:bCs w:val="false"/>
+                <w:color w:val="334155"/>
+                <w:sz w:val="22"/>
+                <w:szCs w:val="22"/>
+              </w:rPr>
+              <w:t xml:space="preserve">271,126</w:t>
+            </w:r>
+          </w:p>
+        </w:tc>
+        <w:tc>
+          <w:tcPr>
+            <w:tcW w:type="pct" w:w="20%"/>
+          </w:tcPr>
+          <w:p>
+            <w:pPr>
+              <w:spacing w:after="80" w:before="80"/>
+            </w:pPr>
+            <w:r>
+              <w:rPr>
+                <w:rFonts w:ascii="Arial" w:cs="Arial" w:eastAsia="Arial" w:hAnsi="Arial"/>
+                <w:b w:val="false"/>
+                <w:bCs w:val="false"/>
+                <w:color w:val="334155"/>
+                <w:sz w:val="22"/>
+                <w:szCs w:val="22"/>
+              </w:rPr>
+              <w:t xml:space="preserve">Nov 2021 – Aug 2026</w:t>
+            </w:r>
+          </w:p>
+        </w:tc>
+        <w:tc>
+          <w:tcPr>
+            <w:tcW w:type="pct" w:w="30%"/>
+          </w:tcPr>
+          <w:p>
+            <w:pPr>
+              <w:spacing w:after="80" w:before="80"/>
+            </w:pPr>
+            <w:r>
+              <w:rPr>
+                <w:rFonts w:ascii="Arial" w:cs="Arial" w:eastAsia="Arial" w:hAnsi="Arial"/>
+                <w:b w:val="false"/>
+                <w:bCs w:val="false"/>
+                <w:color w:val="334155"/>
+                <w:sz w:val="22"/>
+                <w:szCs w:val="22"/>
+              </w:rPr>
+              <w:t xml:space="preserve">CloudConvert container upgrade (timecode duration shifts, enhanced vector tags)</w:t>
+            </w:r>
+          </w:p>
+        </w:tc>
+      </w:tr>
+      <w:tr>
+        <w:tc>
+          <w:tcPr>
+            <w:tcW w:type="pct" w:w="18%"/>
+          </w:tcPr>
+          <w:p>
+            <w:pPr>
+              <w:spacing w:after="80" w:before="80"/>
+            </w:pPr>
+            <w:r>
+              <w:rPr>
+                <w:rFonts w:ascii="Arial" w:cs="Arial" w:eastAsia="Arial" w:hAnsi="Arial"/>
+                <w:b w:val="false"/>
+                <w:bCs w:val="false"/>
+                <w:color w:val="334155"/>
+                <w:sz w:val="22"/>
+                <w:szCs w:val="22"/>
+              </w:rPr>
+              <w:t xml:space="preserve">Generation 3</w:t>
+            </w:r>
+          </w:p>
+        </w:tc>
+        <w:tc>
+          <w:tcPr>
+            <w:tcW w:type="pct" w:w="18%"/>
+          </w:tcPr>
+          <w:p>
+            <w:pPr>
+              <w:spacing w:after="80" w:before="80"/>
+            </w:pPr>
+            <w:r>
+              <w:rPr>
+                <w:rFonts w:ascii="Arial" w:cs="Arial" w:eastAsia="Arial" w:hAnsi="Arial"/>
+                <w:b w:val="false"/>
+                <w:bCs w:val="false"/>
+                <w:color w:val="334155"/>
+                <w:sz w:val="22"/>
+                <w:szCs w:val="22"/>
+              </w:rPr>
+              <w:t xml:space="preserve">NO_EXIFTOOL_TAG</w:t>
+            </w:r>
+          </w:p>
+        </w:tc>
+        <w:tc>
+          <w:tcPr>
+            <w:tcW w:type="pct" w:w="14%"/>
+          </w:tcPr>
+          <w:p>
+            <w:pPr>
+              <w:spacing w:after="80" w:before="80"/>
+            </w:pPr>
+            <w:r>
+              <w:rPr>
+                <w:rFonts w:ascii="Arial" w:cs="Arial" w:eastAsia="Arial" w:hAnsi="Arial"/>
+                <w:b w:val="false"/>
+                <w:bCs w:val="false"/>
+                <w:color w:val="334155"/>
+                <w:sz w:val="22"/>
+                <w:szCs w:val="22"/>
+              </w:rPr>
+              <w:t xml:space="preserve">272,602</w:t>
+            </w:r>
+          </w:p>
+        </w:tc>
+        <w:tc>
+          <w:tcPr>
+            <w:tcW w:type="pct" w:w="20%"/>
+          </w:tcPr>
+          <w:p>
+            <w:pPr>
+              <w:spacing w:after="80" w:before="80"/>
+            </w:pPr>
+            <w:r>
+              <w:rPr>
+                <w:rFonts w:ascii="Arial" w:cs="Arial" w:eastAsia="Arial" w:hAnsi="Arial"/>
+                <w:b w:val="false"/>
+                <w:bCs w:val="false"/>
+                <w:color w:val="334155"/>
+                <w:sz w:val="22"/>
+                <w:szCs w:val="22"/>
+              </w:rPr>
+              <w:t xml:space="preserve">Mar 2022 – Aug 2026</w:t>
+            </w:r>
+          </w:p>
+        </w:tc>
+        <w:tc>
+          <w:tcPr>
+            <w:tcW w:type="pct" w:w="30%"/>
+          </w:tcPr>
+          <w:p>
+            <w:pPr>
+              <w:spacing w:after="80" w:before="80"/>
+            </w:pPr>
+            <w:r>
+              <w:rPr>
+                <w:rFonts w:ascii="Arial" w:cs="Arial" w:eastAsia="Arial" w:hAnsi="Arial"/>
+                <w:b w:val="false"/>
+                <w:bCs w:val="false"/>
+                <w:color w:val="334155"/>
+                <w:sz w:val="22"/>
+                <w:szCs w:val="22"/>
+              </w:rPr>
+              <w:t xml:space="preserve">S3 header-only or non-standard extractions</w:t>
+            </w:r>
+          </w:p>
+        </w:tc>
+      </w:tr>
+    </w:tbl>
+    <w:p>
+      <w:pPr>
+        <w:spacing w:after="60" w:before="180"/>
+      </w:pPr>
+    </w:p>
+    <w:p>
+      <w:pPr>
+        <w:pStyle w:val="Heading2"/>
+        <w:spacing w:after="100" w:before="260"/>
+      </w:pPr>
+      <w:r>
+        <w:rPr>
+          <w:rFonts w:ascii="Arial" w:cs="Arial" w:eastAsia="Arial" w:hAnsi="Arial"/>
+          <w:b/>
+          <w:bCs/>
+          <w:color w:val="0F172A"/>
+          <w:sz w:val="24"/>
+          <w:szCs w:val="24"/>
+        </w:rPr>
+        <w:t xml:space="preserve">Real-World Discrepancy Case Studies from Historical Data:</w:t>
+      </w:r>
+    </w:p>
+    <w:p>
+      <w:pPr>
+        <w:spacing w:after="120" w:before="100"/>
       </w:pPr>
       <w:r>
         <w:rPr>
@@ -362,12 +820,31 @@
           <w:sz w:val="24"/>
           <w:szCs w:val="24"/>
         </w:rPr>
-        <w:t xml:space="preserve">2. Frontend: Upload Complete API Call to Backend Service</w:t>
-      </w:r>
-    </w:p>
-    <w:p>
-      <w:pPr>
-        <w:spacing w:after="140" w:before="120"/>
+        <w:t xml:space="preserve">• Case 1: Video Duration Format Shift (Decimal Seconds vs. Timecodes)</w:t>
+      </w:r>
+    </w:p>
+    <w:p>
+      <w:pPr>
+        <w:spacing w:after="120" w:before="100"/>
+      </w:pPr>
+      <w:r>
+        <w:rPr>
+          <w:rFonts w:ascii="Arial" w:cs="Arial" w:eastAsia="Arial" w:hAnsi="Arial"/>
+          <w:b w:val="false"/>
+          <w:bCs w:val="false"/>
+          <w:i/>
+          <w:iCs/>
+          <w:color w:val="1E293B"/>
+          <w:sz w:val="24"/>
+          <w:szCs w:val="24"/>
+        </w:rPr>
+        <w:t xml:space="preserve">In earlier uploads, video duration was stored as a decimal string with unit ("20.00 s"). Following upstream tool updates, the format shifted to a timecode string ("0:00:30"). Standard numerical parsing functions (parseFloat) evaluate "0:00:30" as 0, causing downstream rendering engines to miscalculate asset length unless complex string-splitting fallback logic was applied.
+Evidence: File #259754 (SO_Enterprise_C12_Rent_A_Car_ENG_Molde_1.mp4, 2024-09-19): Duration: "20.00 s" vs File #475028 (Allstate_C1_Generic_ATX_Base_South.mp4, 2026-01-27): Duration: "0:00:30".</w:t>
+      </w:r>
+    </w:p>
+    <w:p>
+      <w:pPr>
+        <w:spacing w:after="120" w:before="100"/>
       </w:pPr>
       <w:r>
         <w:rPr>
@@ -380,12 +857,30 @@
           <w:sz w:val="24"/>
           <w:szCs w:val="24"/>
         </w:rPr>
-        <w:t xml:space="preserve">3. Backend Service: Enqueue Task in Amazon SQS Queue Buffer</w:t>
-      </w:r>
-    </w:p>
-    <w:p>
-      <w:pPr>
-        <w:spacing w:after="140" w:before="120"/>
+        <w:t xml:space="preserve">• Case 2: Bitrate Tag Splitting (AvgBitrate vs. Bitrate vs. VideoBitrate)</w:t>
+      </w:r>
+    </w:p>
+    <w:p>
+      <w:pPr>
+        <w:spacing w:after="120" w:before="100"/>
+      </w:pPr>
+      <w:r>
+        <w:rPr>
+          <w:rFonts w:ascii="Arial" w:cs="Arial" w:eastAsia="Arial" w:hAnsi="Arial"/>
+          <w:b w:val="false"/>
+          <w:bCs w:val="false"/>
+          <w:i/>
+          <w:iCs/>
+          <w:color w:val="1E293B"/>
+          <w:sz w:val="24"/>
+          <w:szCs w:val="24"/>
+        </w:rPr>
+        <w:t xml:space="preserve">Older systems looked for a single Bitrate field. Newer MP4/MOV extractions exclusively output AvgBitrate, while MPEG videos output VideoBitrate. Across 142,287 MP4 videos, 117,445 files contain AvgBitrate, while only 8 files contain Bitrate. Code querying metadata.Bitrate returned empty values for over 99% of video assets.</w:t>
+      </w:r>
+    </w:p>
+    <w:p>
+      <w:pPr>
+        <w:spacing w:after="120" w:before="100"/>
       </w:pPr>
       <w:r>
         <w:rPr>
@@ -398,12 +893,31 @@
           <w:sz w:val="24"/>
           <w:szCs w:val="24"/>
         </w:rPr>
-        <w:t xml:space="preserve">4. Amazon SQS Queue: Asynchronous Trigger to Existing AWS Lambda (In-House Engine: &lt;400ms)</w:t>
-      </w:r>
-    </w:p>
-    <w:p>
-      <w:pPr>
-        <w:spacing w:after="140" w:before="120"/>
+        <w:t xml:space="preserve">• Case 3: Adobe Illustrator Canvas Dimensions (MaxPageSizeW vs. ImageWidth)</w:t>
+      </w:r>
+    </w:p>
+    <w:p>
+      <w:pPr>
+        <w:spacing w:after="120" w:before="100"/>
+      </w:pPr>
+      <w:r>
+        <w:rPr>
+          <w:rFonts w:ascii="Arial" w:cs="Arial" w:eastAsia="Arial" w:hAnsi="Arial"/>
+          <w:b w:val="false"/>
+          <w:bCs w:val="false"/>
+          <w:i/>
+          <w:iCs/>
+          <w:color w:val="1E293B"/>
+          <w:sz w:val="24"/>
+          <w:szCs w:val="24"/>
+        </w:rPr>
+        <w:t xml:space="preserve">Vector artwork files (.ai / .eps) do not contain a pixel grid. ExifTool returns ImageWidth: null and instead stores the true artboard canvas dimensions inside MaxPageSizeW and BoundingBox. Across 2,099 Adobe Illustrator master assets, ImageWidth is completely null.
+Evidence: File #381646 (SO_P&amp;G_Gillette_C2_SharedStatic_Base_Artwork_1.ai): ImageWidth: null, MaxPageSizeW: "242", BoundingBox: "-4 -263 1746 14"; File #307768 (SO_UEFA_C6_VAR_Base_144px_(246m)_1.ai): ImageWidth: null, MaxPageSizeW: "18800".</w:t>
+      </w:r>
+    </w:p>
+    <w:p>
+      <w:pPr>
+        <w:spacing w:after="120" w:before="100"/>
       </w:pPr>
       <w:r>
         <w:rPr>
@@ -416,29 +930,31 @@
           <w:sz w:val="24"/>
           <w:szCs w:val="24"/>
         </w:rPr>
-        <w:t xml:space="preserve">5. Existing AWS Lambda: Direct Database Save to PostgreSQL files.metadata</w:t>
-      </w:r>
-    </w:p>
-    <w:p>
-      <w:pPr>
-        <w:pStyle w:val="Heading2"/>
-        <w:spacing w:after="120" w:before="280"/>
-      </w:pPr>
-      <w:r>
-        <w:rPr>
-          <w:rFonts w:ascii="Arial" w:cs="Arial" w:eastAsia="Arial" w:hAnsi="Arial"/>
-          <w:b/>
-          <w:bCs/>
-          <w:color w:val="0F172A"/>
-          <w:sz w:val="26"/>
-          <w:szCs w:val="26"/>
-        </w:rPr>
-        <w:t xml:space="preserve">Problem Analyses &amp; Architectural Resolutions:</w:t>
-      </w:r>
-    </w:p>
-    <w:p>
-      <w:pPr>
-        <w:spacing w:after="140" w:before="120"/>
+        <w:t xml:space="preserve">• Case 4: Document Page Count Tag Changes (PageCount vs. Pages)</w:t>
+      </w:r>
+    </w:p>
+    <w:p>
+      <w:pPr>
+        <w:spacing w:after="120" w:before="100"/>
+      </w:pPr>
+      <w:r>
+        <w:rPr>
+          <w:rFonts w:ascii="Arial" w:cs="Arial" w:eastAsia="Arial" w:hAnsi="Arial"/>
+          <w:b w:val="false"/>
+          <w:bCs w:val="false"/>
+          <w:i/>
+          <w:iCs/>
+          <w:color w:val="1E293B"/>
+          <w:sz w:val="24"/>
+          <w:szCs w:val="24"/>
+        </w:rPr>
+        <w:t xml:space="preserve">Early PostScript files recorded document lengths under Pages, whereas standard PDF extractions output PageCount.
+Evidence: File #308888 (Brax_C15_SUPERBET_ISG_Virtual_Carpets_All_Venues_1.pdf): PageCount: "1", Pages: null; 30 legacy PostScript documents contain Pages: 1.</w:t>
+      </w:r>
+    </w:p>
+    <w:p>
+      <w:pPr>
+        <w:spacing w:after="120" w:before="100"/>
       </w:pPr>
       <w:r>
         <w:rPr>
@@ -451,12 +967,31 @@
           <w:sz w:val="24"/>
           <w:szCs w:val="24"/>
         </w:rPr>
-        <w:t xml:space="preserve">• Upstream Version Changes &amp; Data Inconsistencies: Because CloudConvert is an unversioned third-party service, updates to its internal toolchain occur without notice. Over six years of operation, this has resulted in mixed data structures across historical campaign files (older assets contain legacy attribute names; newer assets contain updated names). Embedding ExifTool directly within our Lambda locks in a specific, stable version, guaranteeing 100% schema consistency.</w:t>
-      </w:r>
-    </w:p>
-    <w:p>
-      <w:pPr>
-        <w:spacing w:after="140" w:before="120"/>
+        <w:t xml:space="preserve">• Case 5: PNG Resolution &amp; DPI Inconsistencies (XResolution vs. PixelsPerUnitX)</w:t>
+      </w:r>
+    </w:p>
+    <w:p>
+      <w:pPr>
+        <w:spacing w:after="120" w:before="100"/>
+      </w:pPr>
+      <w:r>
+        <w:rPr>
+          <w:rFonts w:ascii="Arial" w:cs="Arial" w:eastAsia="Arial" w:hAnsi="Arial"/>
+          <w:b w:val="false"/>
+          <w:bCs w:val="false"/>
+          <w:i/>
+          <w:iCs/>
+          <w:color w:val="1E293B"/>
+          <w:sz w:val="24"/>
+          <w:szCs w:val="24"/>
+        </w:rPr>
+        <w:t xml:space="preserve">Image resolution is recorded either under XResolution (in inches) or raw pixel density PixelsPerUnitX (in meters) depending on the authoring software and upstream parser state.
+Evidence: File #562777 (1XBET_C11_222_BA2_BGR.png): contains XResolution: "144", ResolutionUnit: "inches", PixelsPerUnitX: "5669"; File #546446 (AFC_Commercial_Team_C4_Ca3_FT_5.png): XResolution: null, PixelsPerUnitX: "2835".</w:t>
+      </w:r>
+    </w:p>
+    <w:p>
+      <w:pPr>
+        <w:spacing w:after="120" w:before="100"/>
       </w:pPr>
       <w:r>
         <w:rPr>
@@ -469,31 +1004,37 @@
           <w:sz w:val="24"/>
           <w:szCs w:val="24"/>
         </w:rPr>
-        <w:t xml:space="preserve">• Extraction Latency &amp; Extended Lambda Lifecycles: CloudConvert requires external job creation, remote queueing, and network transit (taking 2s to 28s per file). The in-house engine completes extraction in under 400 milliseconds, reducing Lambda execution time by over 90% and eliminating external network failure risks.</w:t>
-      </w:r>
-    </w:p>
-    <w:p>
-      <w:pPr>
-        <w:spacing w:after="140" w:before="120"/>
+        <w:t xml:space="preserve">• Case 6: Photoshop Layer Data &amp; Color Spaces (PSD Assets)</w:t>
+      </w:r>
+    </w:p>
+    <w:p>
+      <w:pPr>
+        <w:spacing w:after="120" w:before="100"/>
       </w:pPr>
       <w:r>
         <w:rPr>
           <w:rFonts w:ascii="Arial" w:cs="Arial" w:eastAsia="Arial" w:hAnsi="Arial"/>
           <w:b w:val="false"/>
           <w:bCs w:val="false"/>
-          <w:i w:val="false"/>
-          <w:iCs w:val="false"/>
+          <w:i/>
+          <w:iCs/>
           <w:color w:val="1E293B"/>
           <w:sz w:val="24"/>
           <w:szCs w:val="24"/>
         </w:rPr>
-        <w:t xml:space="preserve">• Zero Additional Infrastructure Cost: Because the AWS Lambda function and database connections are already in place, this upgrade simply updates the logic inside the existing function. Compute costs remain identical, while 100% of third-party CloudConvert credit fees are eliminated.</w:t>
-      </w:r>
+        <w:t xml:space="preserve">Master Photoshop PSD files require layer count and color space data for automated rendering. Upstream changes varied between returning raw color space integers vs. descriptive strings.
+Evidence: File #393594 (National_Partners-Shared_Artwork_C9_V2_Miele_Base_144_1.psd): LayerCount: "4", ColorSpace: "sRGB"; File #377806 (SO_Apple_C7_Stick_Group_2_Base_2.psd): LayerCount: "11", ColorSpace: "Uncalibrated".</w:t>
+      </w:r>
+    </w:p>
+    <w:p>
+      <w:pPr>
+        <w:spacing w:after="60" w:before="180"/>
+      </w:pPr>
     </w:p>
     <w:p>
       <w:pPr>
         <w:pStyle w:val="Heading1"/>
-        <w:spacing w:after="120" w:before="280"/>
+        <w:spacing w:after="100" w:before="260"/>
       </w:pPr>
       <w:r>
         <w:rPr>
@@ -501,15 +1042,15 @@
           <w:b/>
           <w:bCs/>
           <w:color w:val="0F172A"/>
-          <w:sz w:val="30"/>
-          <w:szCs w:val="30"/>
-        </w:rPr>
-        <w:t xml:space="preserve">3. Proof of Concept (POC) Validation &amp; Benchmark Results</w:t>
-      </w:r>
-    </w:p>
-    <w:p>
-      <w:pPr>
-        <w:spacing w:after="140" w:before="120"/>
+          <w:sz w:val="28"/>
+          <w:szCs w:val="28"/>
+        </w:rPr>
+        <w:t xml:space="preserve">4. Proof of Concept (POC) Validation &amp; Benchmark Results</w:t>
+      </w:r>
+    </w:p>
+    <w:p>
+      <w:pPr>
+        <w:spacing w:after="120" w:before="100"/>
       </w:pPr>
       <w:r>
         <w:rPr>
@@ -1324,13 +1865,13 @@
     </w:tbl>
     <w:p>
       <w:pPr>
-        <w:spacing w:after="100" w:before="200"/>
+        <w:spacing w:after="60" w:before="180"/>
       </w:pPr>
     </w:p>
     <w:p>
       <w:pPr>
         <w:pStyle w:val="Heading2"/>
-        <w:spacing w:after="120" w:before="280"/>
+        <w:spacing w:after="100" w:before="260"/>
       </w:pPr>
       <w:r>
         <w:rPr>
@@ -1338,28 +1879,10 @@
           <w:b/>
           <w:bCs/>
           <w:color w:val="0F172A"/>
-          <w:sz w:val="26"/>
-          <w:szCs w:val="26"/>
-        </w:rPr>
-        <w:t xml:space="preserve">Live Real-Time Benchmark Comparison:</w:t>
-      </w:r>
-    </w:p>
-    <w:p>
-      <w:pPr>
-        <w:spacing w:after="140" w:before="120"/>
-      </w:pPr>
-      <w:r>
-        <w:rPr>
-          <w:rFonts w:ascii="Arial" w:cs="Arial" w:eastAsia="Arial" w:hAnsi="Arial"/>
-          <w:b w:val="false"/>
-          <w:bCs w:val="false"/>
-          <w:i w:val="false"/>
-          <w:iCs w:val="false"/>
-          <w:color w:val="1E293B"/>
           <w:sz w:val="24"/>
           <w:szCs w:val="24"/>
         </w:rPr>
-        <w:t xml:space="preserve">A live benchmark was conducted comparing real-time CloudConvert API responses against the in-house engine on identical assets:</w:t>
+        <w:t xml:space="preserve">Live Real-Time Benchmark Comparison:</w:t>
       </w:r>
     </w:p>
     <w:tbl>
@@ -1989,13 +2512,13 @@
     </w:tbl>
     <w:p>
       <w:pPr>
-        <w:spacing w:after="100" w:before="200"/>
+        <w:spacing w:after="60" w:before="180"/>
       </w:pPr>
     </w:p>
     <w:p>
       <w:pPr>
         <w:pStyle w:val="Heading1"/>
-        <w:spacing w:after="120" w:before="280"/>
+        <w:spacing w:after="100" w:before="260"/>
       </w:pPr>
       <w:r>
         <w:rPr>
@@ -2003,15 +2526,15 @@
           <w:b/>
           <w:bCs/>
           <w:color w:val="0F172A"/>
-          <w:sz w:val="30"/>
-          <w:szCs w:val="30"/>
-        </w:rPr>
-        <w:t xml:space="preserve">4. Architectural Enhancements &amp; Stability</w:t>
-      </w:r>
-    </w:p>
-    <w:p>
-      <w:pPr>
-        <w:spacing w:after="140" w:before="120"/>
+          <w:sz w:val="28"/>
+          <w:szCs w:val="28"/>
+        </w:rPr>
+        <w:t xml:space="preserve">5. Architectural Enhancements &amp; Stability</w:t>
+      </w:r>
+    </w:p>
+    <w:p>
+      <w:pPr>
+        <w:spacing w:after="120" w:before="100"/>
       </w:pPr>
       <w:r>
         <w:rPr>
@@ -2024,12 +2547,12 @@
           <w:sz w:val="24"/>
           <w:szCs w:val="24"/>
         </w:rPr>
-        <w:t xml:space="preserve">In addition to replacing the external service call inside the Lambda, we recommend adding an Amazon SQS message queue buffer between the backend API and the Lambda:</w:t>
-      </w:r>
-    </w:p>
-    <w:p>
-      <w:pPr>
-        <w:spacing w:after="140" w:before="120"/>
+        <w:t xml:space="preserve">• Burst Upload Protection: During large campaign launches, Amazon SQS buffers incoming jobs to ensure the Lambda processes files steadily without database connection spikes.</w:t>
+      </w:r>
+    </w:p>
+    <w:p>
+      <w:pPr>
+        <w:spacing w:after="120" w:before="100"/>
       </w:pPr>
       <w:r>
         <w:rPr>
@@ -2042,12 +2565,12 @@
           <w:sz w:val="24"/>
           <w:szCs w:val="24"/>
         </w:rPr>
-        <w:t xml:space="preserve">• Burst Upload Protection: During large campaign launches where multiple assets are uploaded simultaneously, the queue cleanly buffers incoming jobs. This ensures the Lambda processes files steadily without spiking concurrent database connections.</w:t>
-      </w:r>
-    </w:p>
-    <w:p>
-      <w:pPr>
-        <w:spacing w:after="140" w:before="120"/>
+        <w:t xml:space="preserve">• Automated Error Handling: Corrupt or malformed files route to a Dead-Letter Queue (DLQ) for alerting without blocking remaining assets.</w:t>
+      </w:r>
+    </w:p>
+    <w:p>
+      <w:pPr>
+        <w:spacing w:after="120" w:before="100"/>
       </w:pPr>
       <w:r>
         <w:rPr>
@@ -2060,31 +2583,13 @@
           <w:sz w:val="24"/>
           <w:szCs w:val="24"/>
         </w:rPr>
-        <w:t xml:space="preserve">• Automated Error Handling: If an invalid or corrupted file is uploaded, the queue safely routes it to a Dead-Letter Queue (DLQ) for alerting, without interrupting the processing of other assets.</w:t>
-      </w:r>
-    </w:p>
-    <w:p>
-      <w:pPr>
-        <w:spacing w:after="140" w:before="120"/>
-      </w:pPr>
-      <w:r>
-        <w:rPr>
-          <w:rFonts w:ascii="Arial" w:cs="Arial" w:eastAsia="Arial" w:hAnsi="Arial"/>
-          <w:b w:val="false"/>
-          <w:bCs w:val="false"/>
-          <w:i w:val="false"/>
-          <w:iCs w:val="false"/>
-          <w:color w:val="1E293B"/>
-          <w:sz w:val="24"/>
-          <w:szCs w:val="24"/>
-        </w:rPr>
-        <w:t xml:space="preserve">• Enhanced Security: Media assets remain entirely inside our private AWS environment and are never transmitted to external third-party infrastructure.</w:t>
+        <w:t xml:space="preserve">• Enhanced Security: Media assets remain entirely inside our private AWS environment.</w:t>
       </w:r>
     </w:p>
     <w:p>
       <w:pPr>
         <w:pStyle w:val="Heading1"/>
-        <w:spacing w:after="120" w:before="280"/>
+        <w:spacing w:after="100" w:before="260"/>
       </w:pPr>
       <w:r>
         <w:rPr>
@@ -2092,10 +2597,10 @@
           <w:b/>
           <w:bCs/>
           <w:color w:val="0F172A"/>
-          <w:sz w:val="30"/>
-          <w:szCs w:val="30"/>
-        </w:rPr>
-        <w:t xml:space="preserve">5. Strategic Business Impact Summary</w:t>
+          <w:sz w:val="28"/>
+          <w:szCs w:val="28"/>
+        </w:rPr>
+        <w:t xml:space="preserve">6. Strategic Business Impact Summary</w:t>
       </w:r>
     </w:p>
     <w:tbl>
@@ -2725,13 +3230,8 @@
     </w:tbl>
     <w:p>
       <w:pPr>
-        <w:spacing w:after="100" w:before="200"/>
-      </w:pPr>
-    </w:p>
-    <w:p>
-      <w:pPr>
         <w:pStyle w:val="Heading1"/>
-        <w:spacing w:after="120" w:before="280"/>
+        <w:spacing w:after="100" w:before="260"/>
       </w:pPr>
       <w:r>
         <w:rPr>
@@ -2739,15 +3239,15 @@
           <w:b/>
           <w:bCs/>
           <w:color w:val="0F172A"/>
-          <w:sz w:val="30"/>
-          <w:szCs w:val="30"/>
-        </w:rPr>
-        <w:t xml:space="preserve">6. Conclusion</w:t>
-      </w:r>
-    </w:p>
-    <w:p>
-      <w:pPr>
-        <w:spacing w:after="140" w:before="120"/>
+          <w:sz w:val="28"/>
+          <w:szCs w:val="28"/>
+        </w:rPr>
+        <w:t xml:space="preserve">7. Conclusion</w:t>
+      </w:r>
+    </w:p>
+    <w:p>
+      <w:pPr>
+        <w:spacing w:after="120" w:before="100"/>
       </w:pPr>
       <w:r>
         <w:rPr>

</xml_diff>